<commit_message>
added session.md and pushing some test results which are not considered for now
</commit_message>
<xml_diff>
--- a/DS252_PRD_MCP_Prewarmer_TeamID 1 (3).docx
+++ b/DS252_PRD_MCP_Prewarmer_TeamID 1 (3).docx
@@ -334,17 +334,8 @@
                 <w:rFonts w:ascii="Times New Roman" w:eastAsia="Times New Roman" w:hAnsi="Times New Roman" w:cs="Times New Roman"/>
                 <w:sz w:val="22"/>
               </w:rPr>
-              <w:t xml:space="preserve"> - 28674</w:t>
-            </w:r>
-            <w:proofErr w:type="gramStart"/>
-            <w:r>
-              <w:rPr>
-                <w:rFonts w:ascii="Times New Roman" w:eastAsia="Times New Roman" w:hAnsi="Times New Roman" w:cs="Times New Roman"/>
-                <w:sz w:val="22"/>
-              </w:rPr>
-              <w:t>] ;</w:t>
-            </w:r>
-            <w:proofErr w:type="gramEnd"/>
+              <w:t xml:space="preserve"> - 28674] ;</w:t>
+            </w:r>
             <w:r>
               <w:rPr>
                 <w:rFonts w:ascii="Times New Roman" w:eastAsia="Times New Roman" w:hAnsi="Times New Roman" w:cs="Times New Roman"/>
@@ -782,21 +773,7 @@
         <w:rPr>
           <w:rFonts w:ascii="Times New Roman" w:eastAsia="Times New Roman" w:hAnsi="Times New Roman" w:cs="Times New Roman"/>
         </w:rPr>
-        <w:t xml:space="preserve">such as customer support </w:t>
-      </w:r>
-      <w:proofErr w:type="gramStart"/>
-      <w:r>
-        <w:rPr>
-          <w:rFonts w:ascii="Times New Roman" w:eastAsia="Times New Roman" w:hAnsi="Times New Roman" w:cs="Times New Roman"/>
-        </w:rPr>
-        <w:t>bots</w:t>
-      </w:r>
-      <w:proofErr w:type="gramEnd"/>
-      <w:r>
-        <w:rPr>
-          <w:rFonts w:ascii="Times New Roman" w:eastAsia="Times New Roman" w:hAnsi="Times New Roman" w:cs="Times New Roman"/>
-        </w:rPr>
-        <w:t xml:space="preserve"> calling CRM/ticketing APIs or research agents orchestrating multi-step web searches</w:t>
+        <w:t>such as customer support bots calling CRM/ticketing APIs or research agents orchestrating multi-step web searches</w:t>
       </w:r>
       <w:r>
         <w:rPr>
@@ -1111,21 +1088,7 @@
         <w:rPr>
           <w:rFonts w:ascii="Times New Roman" w:eastAsia="Times New Roman" w:hAnsi="Times New Roman" w:cs="Times New Roman"/>
         </w:rPr>
-        <w:t xml:space="preserve">Agent </w:t>
-      </w:r>
-      <w:proofErr w:type="gramStart"/>
-      <w:r>
-        <w:rPr>
-          <w:rFonts w:ascii="Times New Roman" w:eastAsia="Times New Roman" w:hAnsi="Times New Roman" w:cs="Times New Roman"/>
-        </w:rPr>
-        <w:t>developer provides with</w:t>
-      </w:r>
-      <w:proofErr w:type="gramEnd"/>
-      <w:r>
-        <w:rPr>
-          <w:rFonts w:ascii="Times New Roman" w:eastAsia="Times New Roman" w:hAnsi="Times New Roman" w:cs="Times New Roman"/>
-        </w:rPr>
-        <w:t xml:space="preserve"> the workflow definition for every unique workflow id</w:t>
+        <w:t>Agent developer provides with the workflow definition for every unique workflow id</w:t>
       </w:r>
     </w:p>
     <w:p>
@@ -1176,21 +1139,7 @@
         <w:rPr>
           <w:rFonts w:ascii="Times New Roman" w:eastAsia="Times New Roman" w:hAnsi="Times New Roman" w:cs="Times New Roman"/>
         </w:rPr>
-        <w:t xml:space="preserve">The Kubernetes cluster has adequate CPU/memory </w:t>
-      </w:r>
-      <w:proofErr w:type="gramStart"/>
-      <w:r>
-        <w:rPr>
-          <w:rFonts w:ascii="Times New Roman" w:eastAsia="Times New Roman" w:hAnsi="Times New Roman" w:cs="Times New Roman"/>
-        </w:rPr>
-        <w:t>headroom</w:t>
-      </w:r>
-      <w:proofErr w:type="gramEnd"/>
-      <w:r>
-        <w:rPr>
-          <w:rFonts w:ascii="Times New Roman" w:eastAsia="Times New Roman" w:hAnsi="Times New Roman" w:cs="Times New Roman"/>
-        </w:rPr>
-        <w:t xml:space="preserve"> so scheduling reflects true control-plane reconciliation rather than resource starvation.</w:t>
+        <w:t>The Kubernetes cluster has adequate CPU/memory headroom so scheduling reflects true control-plane reconciliation rather than resource starvation.</w:t>
       </w:r>
     </w:p>
     <w:p>
@@ -2327,23 +2276,7 @@
                 <w:rFonts w:ascii="Times New Roman" w:eastAsia="Times New Roman" w:hAnsi="Times New Roman" w:cs="Times New Roman"/>
                 <w:sz w:val="22"/>
               </w:rPr>
-              <w:t xml:space="preserve">Probabilities are returned and </w:t>
-            </w:r>
-            <w:proofErr w:type="gramStart"/>
-            <w:r>
-              <w:rPr>
-                <w:rFonts w:ascii="Times New Roman" w:eastAsia="Times New Roman" w:hAnsi="Times New Roman" w:cs="Times New Roman"/>
-                <w:sz w:val="22"/>
-              </w:rPr>
-              <w:t>sum</w:t>
-            </w:r>
-            <w:proofErr w:type="gramEnd"/>
-            <w:r>
-              <w:rPr>
-                <w:rFonts w:ascii="Times New Roman" w:eastAsia="Times New Roman" w:hAnsi="Times New Roman" w:cs="Times New Roman"/>
-                <w:sz w:val="22"/>
-              </w:rPr>
-              <w:t xml:space="preserve"> to 1.0 ±0.01.</w:t>
+              <w:t>Probabilities are returned and sum to 1.0 ±0.01.</w:t>
             </w:r>
           </w:p>
         </w:tc>
@@ -3315,21 +3248,12 @@
                 <w:sz w:val="22"/>
               </w:rPr>
             </w:pPr>
-            <w:proofErr w:type="gramStart"/>
-            <w:r>
-              <w:rPr>
-                <w:rFonts w:ascii="Times New Roman" w:eastAsia="Times New Roman" w:hAnsi="Times New Roman" w:cs="Times New Roman"/>
-                <w:sz w:val="22"/>
-              </w:rPr>
-              <w:t>Log</w:t>
-            </w:r>
-            <w:proofErr w:type="gramEnd"/>
-            <w:r>
-              <w:rPr>
-                <w:rFonts w:ascii="Times New Roman" w:eastAsia="Times New Roman" w:hAnsi="Times New Roman" w:cs="Times New Roman"/>
-                <w:sz w:val="22"/>
-              </w:rPr>
-              <w:t xml:space="preserve"> prewarm/retain/evict decisions</w:t>
+            <w:r>
+              <w:rPr>
+                <w:rFonts w:ascii="Times New Roman" w:eastAsia="Times New Roman" w:hAnsi="Times New Roman" w:cs="Times New Roman"/>
+                <w:sz w:val="22"/>
+              </w:rPr>
+              <w:t>Log prewarm/retain/evict decisions</w:t>
             </w:r>
           </w:p>
         </w:tc>
@@ -3357,39 +3281,7 @@
                 <w:rFonts w:ascii="Times New Roman" w:eastAsia="Times New Roman" w:hAnsi="Times New Roman" w:cs="Times New Roman"/>
                 <w:sz w:val="22"/>
               </w:rPr>
-              <w:t xml:space="preserve">Audit </w:t>
-            </w:r>
-            <w:proofErr w:type="gramStart"/>
-            <w:r>
-              <w:rPr>
-                <w:rFonts w:ascii="Times New Roman" w:eastAsia="Times New Roman" w:hAnsi="Times New Roman" w:cs="Times New Roman"/>
-                <w:sz w:val="22"/>
-              </w:rPr>
-              <w:t>record contains</w:t>
-            </w:r>
-            <w:proofErr w:type="gramEnd"/>
-            <w:r>
-              <w:rPr>
-                <w:rFonts w:ascii="Times New Roman" w:eastAsia="Times New Roman" w:hAnsi="Times New Roman" w:cs="Times New Roman"/>
-                <w:sz w:val="22"/>
-              </w:rPr>
-              <w:t xml:space="preserve"> </w:t>
-            </w:r>
-            <w:proofErr w:type="gramStart"/>
-            <w:r>
-              <w:rPr>
-                <w:rFonts w:ascii="Times New Roman" w:eastAsia="Times New Roman" w:hAnsi="Times New Roman" w:cs="Times New Roman"/>
-                <w:sz w:val="22"/>
-              </w:rPr>
-              <w:t>tool</w:t>
-            </w:r>
-            <w:proofErr w:type="gramEnd"/>
-            <w:r>
-              <w:rPr>
-                <w:rFonts w:ascii="Times New Roman" w:eastAsia="Times New Roman" w:hAnsi="Times New Roman" w:cs="Times New Roman"/>
-                <w:sz w:val="22"/>
-              </w:rPr>
-              <w:t>, probability, action, TTL, time only.</w:t>
+              <w:t>Audit record contains tool, probability, action, TTL, time only.</w:t>
             </w:r>
           </w:p>
         </w:tc>
@@ -3452,21 +3344,7 @@
         <w:rPr>
           <w:rFonts w:ascii="Times New Roman" w:eastAsia="Times New Roman" w:hAnsi="Times New Roman" w:cs="Times New Roman"/>
         </w:rPr>
-        <w:t xml:space="preserve"> tool execution, 20 concurrent clients, 10-minute steady state, 3 repeated trials. Images are </w:t>
-      </w:r>
-      <w:proofErr w:type="gramStart"/>
-      <w:r>
-        <w:rPr>
-          <w:rFonts w:ascii="Times New Roman" w:eastAsia="Times New Roman" w:hAnsi="Times New Roman" w:cs="Times New Roman"/>
-        </w:rPr>
-        <w:t>cached</w:t>
-      </w:r>
-      <w:proofErr w:type="gramEnd"/>
-      <w:r>
-        <w:rPr>
-          <w:rFonts w:ascii="Times New Roman" w:eastAsia="Times New Roman" w:hAnsi="Times New Roman" w:cs="Times New Roman"/>
-        </w:rPr>
-        <w:t xml:space="preserve"> unless an experiment studies image pulls.</w:t>
+        <w:t xml:space="preserve"> tool execution, 20 concurrent clients, 10-minute steady state, 3 repeated trials. Images are cached unless an experiment studies image pulls.</w:t>
       </w:r>
     </w:p>
     <w:p>
@@ -3745,7 +3623,6 @@
               <w:t xml:space="preserve">Predictive p50 is </w:t>
             </w:r>
             <w:proofErr w:type="spellStart"/>
-            <w:proofErr w:type="gramStart"/>
             <w:r>
               <w:rPr>
                 <w:rFonts w:ascii="Times New Roman" w:eastAsia="Times New Roman" w:hAnsi="Times New Roman" w:cs="Times New Roman"/>
@@ -3754,7 +3631,6 @@
               <w:t>atleast</w:t>
             </w:r>
             <w:proofErr w:type="spellEnd"/>
-            <w:proofErr w:type="gramEnd"/>
             <w:r>
               <w:rPr>
                 <w:rFonts w:ascii="Times New Roman" w:eastAsia="Times New Roman" w:hAnsi="Times New Roman" w:cs="Times New Roman"/>
@@ -3922,7 +3798,6 @@
               <w:t xml:space="preserve">Predictive p99 is </w:t>
             </w:r>
             <w:proofErr w:type="spellStart"/>
-            <w:proofErr w:type="gramStart"/>
             <w:r>
               <w:rPr>
                 <w:rFonts w:ascii="Times New Roman" w:eastAsia="Times New Roman" w:hAnsi="Times New Roman" w:cs="Times New Roman"/>
@@ -3931,7 +3806,6 @@
               <w:t>atleast</w:t>
             </w:r>
             <w:proofErr w:type="spellEnd"/>
-            <w:proofErr w:type="gramEnd"/>
             <w:r>
               <w:rPr>
                 <w:rFonts w:ascii="Times New Roman" w:eastAsia="Times New Roman" w:hAnsi="Times New Roman" w:cs="Times New Roman"/>
@@ -5367,21 +5241,7 @@
         <w:rPr>
           <w:rFonts w:ascii="Times New Roman" w:eastAsia="Times New Roman" w:hAnsi="Times New Roman" w:cs="Times New Roman"/>
         </w:rPr>
-        <w:t xml:space="preserve"> </w:t>
-      </w:r>
-      <w:proofErr w:type="gramStart"/>
-      <w:r>
-        <w:rPr>
-          <w:rFonts w:ascii="Times New Roman" w:eastAsia="Times New Roman" w:hAnsi="Times New Roman" w:cs="Times New Roman"/>
-        </w:rPr>
-        <w:t>state</w:t>
-      </w:r>
-      <w:proofErr w:type="gramEnd"/>
-      <w:r>
-        <w:rPr>
-          <w:rFonts w:ascii="Times New Roman" w:eastAsia="Times New Roman" w:hAnsi="Times New Roman" w:cs="Times New Roman"/>
-        </w:rPr>
-        <w:t xml:space="preserve"> and</w:t>
+        <w:t xml:space="preserve"> state and</w:t>
       </w:r>
       <w:r>
         <w:rPr>
@@ -8024,21 +7884,7 @@
         <w:rPr>
           <w:rFonts w:ascii="Times New Roman" w:eastAsia="Times New Roman" w:hAnsi="Times New Roman" w:cs="Times New Roman"/>
         </w:rPr>
-        <w:t xml:space="preserve"> </w:t>
-      </w:r>
-      <w:proofErr w:type="gramStart"/>
-      <w:r>
-        <w:rPr>
-          <w:rFonts w:ascii="Times New Roman" w:eastAsia="Times New Roman" w:hAnsi="Times New Roman" w:cs="Times New Roman"/>
-        </w:rPr>
-        <w:t>similar to</w:t>
-      </w:r>
-      <w:proofErr w:type="gramEnd"/>
-      <w:r>
-        <w:rPr>
-          <w:rFonts w:ascii="Times New Roman" w:eastAsia="Times New Roman" w:hAnsi="Times New Roman" w:cs="Times New Roman"/>
-        </w:rPr>
-        <w:t xml:space="preserve"> the example stated in </w:t>
+        <w:t xml:space="preserve"> similar to the example stated in </w:t>
       </w:r>
       <w:r>
         <w:rPr>
@@ -9404,6 +9250,7 @@
               <w:bottom w:val="single" w:sz="8" w:space="0" w:color="A6A6A6" w:themeColor="background1" w:themeShade="A6"/>
               <w:right w:val="single" w:sz="8" w:space="0" w:color="A6A6A6" w:themeColor="background1" w:themeShade="A6"/>
             </w:tcBorders>
+            <w:shd w:val="clear" w:color="auto" w:fill="AAE571"/>
             <w:tcMar>
               <w:top w:w="60" w:type="dxa"/>
               <w:left w:w="100" w:type="dxa"/>
@@ -9435,6 +9282,7 @@
               <w:bottom w:val="single" w:sz="8" w:space="0" w:color="A6A6A6" w:themeColor="background1" w:themeShade="A6"/>
               <w:right w:val="single" w:sz="8" w:space="0" w:color="A6A6A6" w:themeColor="background1" w:themeShade="A6"/>
             </w:tcBorders>
+            <w:shd w:val="clear" w:color="auto" w:fill="AAE571"/>
             <w:tcMar>
               <w:top w:w="60" w:type="dxa"/>
               <w:left w:w="100" w:type="dxa"/>
@@ -9474,6 +9322,7 @@
               <w:bottom w:val="single" w:sz="8" w:space="0" w:color="A6A6A6" w:themeColor="background1" w:themeShade="A6"/>
               <w:right w:val="single" w:sz="8" w:space="0" w:color="A6A6A6" w:themeColor="background1" w:themeShade="A6"/>
             </w:tcBorders>
+            <w:shd w:val="clear" w:color="auto" w:fill="AAE571"/>
             <w:tcMar>
               <w:top w:w="60" w:type="dxa"/>
               <w:left w:w="100" w:type="dxa"/>
@@ -9505,6 +9354,7 @@
               <w:bottom w:val="single" w:sz="8" w:space="0" w:color="A6A6A6" w:themeColor="background1" w:themeShade="A6"/>
               <w:right w:val="single" w:sz="8" w:space="0" w:color="A6A6A6" w:themeColor="background1" w:themeShade="A6"/>
             </w:tcBorders>
+            <w:shd w:val="clear" w:color="auto" w:fill="AAE571"/>
             <w:tcMar>
               <w:top w:w="60" w:type="dxa"/>
               <w:left w:w="100" w:type="dxa"/>
@@ -9678,6 +9528,7 @@
               <w:bottom w:val="single" w:sz="8" w:space="0" w:color="A6A6A6" w:themeColor="background1" w:themeShade="A6"/>
               <w:right w:val="single" w:sz="8" w:space="0" w:color="A6A6A6" w:themeColor="background1" w:themeShade="A6"/>
             </w:tcBorders>
+            <w:shd w:val="clear" w:color="auto" w:fill="92D050"/>
             <w:tcMar>
               <w:top w:w="60" w:type="dxa"/>
               <w:left w:w="100" w:type="dxa"/>
@@ -9709,6 +9560,7 @@
               <w:bottom w:val="single" w:sz="8" w:space="0" w:color="A6A6A6" w:themeColor="background1" w:themeShade="A6"/>
               <w:right w:val="single" w:sz="8" w:space="0" w:color="A6A6A6" w:themeColor="background1" w:themeShade="A6"/>
             </w:tcBorders>
+            <w:shd w:val="clear" w:color="auto" w:fill="92D050"/>
             <w:tcMar>
               <w:top w:w="60" w:type="dxa"/>
               <w:left w:w="100" w:type="dxa"/>
@@ -9748,6 +9600,7 @@
               <w:bottom w:val="single" w:sz="8" w:space="0" w:color="A6A6A6" w:themeColor="background1" w:themeShade="A6"/>
               <w:right w:val="single" w:sz="8" w:space="0" w:color="A6A6A6" w:themeColor="background1" w:themeShade="A6"/>
             </w:tcBorders>
+            <w:shd w:val="clear" w:color="auto" w:fill="92D050"/>
             <w:tcMar>
               <w:top w:w="60" w:type="dxa"/>
               <w:left w:w="100" w:type="dxa"/>
@@ -9779,6 +9632,7 @@
               <w:bottom w:val="single" w:sz="8" w:space="0" w:color="A6A6A6" w:themeColor="background1" w:themeShade="A6"/>
               <w:right w:val="single" w:sz="8" w:space="0" w:color="A6A6A6" w:themeColor="background1" w:themeShade="A6"/>
             </w:tcBorders>
+            <w:shd w:val="clear" w:color="auto" w:fill="92D050"/>
             <w:tcMar>
               <w:top w:w="60" w:type="dxa"/>
               <w:left w:w="100" w:type="dxa"/>
@@ -10226,6 +10080,7 @@
               <w:bottom w:val="single" w:sz="8" w:space="0" w:color="A6A6A6" w:themeColor="background1" w:themeShade="A6"/>
               <w:right w:val="single" w:sz="8" w:space="0" w:color="A6A6A6" w:themeColor="background1" w:themeShade="A6"/>
             </w:tcBorders>
+            <w:shd w:val="clear" w:color="auto" w:fill="92D050"/>
             <w:tcMar>
               <w:top w:w="60" w:type="dxa"/>
               <w:left w:w="100" w:type="dxa"/>
@@ -10257,6 +10112,7 @@
               <w:bottom w:val="single" w:sz="8" w:space="0" w:color="A6A6A6" w:themeColor="background1" w:themeShade="A6"/>
               <w:right w:val="single" w:sz="8" w:space="0" w:color="A6A6A6" w:themeColor="background1" w:themeShade="A6"/>
             </w:tcBorders>
+            <w:shd w:val="clear" w:color="auto" w:fill="92D050"/>
             <w:tcMar>
               <w:top w:w="60" w:type="dxa"/>
               <w:left w:w="100" w:type="dxa"/>
@@ -10283,7 +10139,35 @@
               <w:rPr>
                 <w:rFonts w:ascii="Times New Roman" w:eastAsia="Times New Roman" w:hAnsi="Times New Roman" w:cs="Times New Roman"/>
               </w:rPr>
-              <w:t xml:space="preserve"> Bar plot: E per configuration, where E = N</w:t>
+              <w:t xml:space="preserve"> Bar plot: E per configuration, </w:t>
+            </w:r>
+            <w:proofErr w:type="gramStart"/>
+            <w:r>
+              <w:rPr>
+                <w:rFonts w:ascii="Times New Roman" w:eastAsia="Times New Roman" w:hAnsi="Times New Roman" w:cs="Times New Roman"/>
+              </w:rPr>
+              <w:t>where</w:t>
+            </w:r>
+            <w:proofErr w:type="gramEnd"/>
+            <w:r>
+              <w:rPr>
+                <w:rFonts w:ascii="Times New Roman" w:eastAsia="Times New Roman" w:hAnsi="Times New Roman" w:cs="Times New Roman"/>
+              </w:rPr>
+              <w:t xml:space="preserve"> </w:t>
+            </w:r>
+          </w:p>
+          <w:p>
+            <w:pPr>
+              <w:spacing w:after="0"/>
+              <w:rPr>
+                <w:rFonts w:ascii="Times New Roman" w:eastAsia="Times New Roman" w:hAnsi="Times New Roman" w:cs="Times New Roman"/>
+              </w:rPr>
+            </w:pPr>
+            <w:r>
+              <w:rPr>
+                <w:rFonts w:ascii="Times New Roman" w:eastAsia="Times New Roman" w:hAnsi="Times New Roman" w:cs="Times New Roman"/>
+              </w:rPr>
+              <w:t>E = N</w:t>
             </w:r>
             <w:proofErr w:type="gramStart"/>
             <w:r>
@@ -10310,6 +10194,7 @@
               <w:bottom w:val="single" w:sz="8" w:space="0" w:color="A6A6A6" w:themeColor="background1" w:themeShade="A6"/>
               <w:right w:val="single" w:sz="8" w:space="0" w:color="A6A6A6" w:themeColor="background1" w:themeShade="A6"/>
             </w:tcBorders>
+            <w:shd w:val="clear" w:color="auto" w:fill="92D050"/>
             <w:tcMar>
               <w:top w:w="60" w:type="dxa"/>
               <w:left w:w="100" w:type="dxa"/>
@@ -10341,6 +10226,7 @@
               <w:bottom w:val="single" w:sz="8" w:space="0" w:color="A6A6A6" w:themeColor="background1" w:themeShade="A6"/>
               <w:right w:val="single" w:sz="8" w:space="0" w:color="A6A6A6" w:themeColor="background1" w:themeShade="A6"/>
             </w:tcBorders>
+            <w:shd w:val="clear" w:color="auto" w:fill="92D050"/>
             <w:tcMar>
               <w:top w:w="60" w:type="dxa"/>
               <w:left w:w="100" w:type="dxa"/>
@@ -11537,21 +11423,7 @@
         <w:rPr>
           <w:rFonts w:ascii="Times New Roman" w:eastAsia="Times New Roman" w:hAnsi="Times New Roman" w:cs="Times New Roman"/>
         </w:rPr>
-        <w:t xml:space="preserve"> evaluation package and </w:t>
-      </w:r>
-      <w:proofErr w:type="gramStart"/>
-      <w:r>
-        <w:rPr>
-          <w:rFonts w:ascii="Times New Roman" w:eastAsia="Times New Roman" w:hAnsi="Times New Roman" w:cs="Times New Roman"/>
-        </w:rPr>
-        <w:t>final results</w:t>
-      </w:r>
-      <w:proofErr w:type="gramEnd"/>
-      <w:r>
-        <w:rPr>
-          <w:rFonts w:ascii="Times New Roman" w:eastAsia="Times New Roman" w:hAnsi="Times New Roman" w:cs="Times New Roman"/>
-        </w:rPr>
-        <w:t>.</w:t>
+        <w:t xml:space="preserve"> evaluation package and final results.</w:t>
       </w:r>
     </w:p>
     <w:p>
@@ -11841,23 +11713,7 @@
                 <w:rFonts w:ascii="Times New Roman" w:eastAsia="Times New Roman" w:hAnsi="Times New Roman" w:cs="Times New Roman"/>
                 <w:sz w:val="22"/>
               </w:rPr>
-              <w:t xml:space="preserve">Freeze MVP at one predictor/controller and C0/C1/C3; drop advanced models and </w:t>
-            </w:r>
-            <w:proofErr w:type="gramStart"/>
-            <w:r>
-              <w:rPr>
-                <w:rFonts w:ascii="Times New Roman" w:eastAsia="Times New Roman" w:hAnsi="Times New Roman" w:cs="Times New Roman"/>
-                <w:sz w:val="22"/>
-              </w:rPr>
-              <w:t>Top-K</w:t>
-            </w:r>
-            <w:proofErr w:type="gramEnd"/>
-            <w:r>
-              <w:rPr>
-                <w:rFonts w:ascii="Times New Roman" w:eastAsia="Times New Roman" w:hAnsi="Times New Roman" w:cs="Times New Roman"/>
-                <w:sz w:val="22"/>
-              </w:rPr>
-              <w:t xml:space="preserve"> first.</w:t>
+              <w:t>Freeze MVP at one predictor/controller and C0/C1/C3; drop advanced models and Top-K first.</w:t>
             </w:r>
           </w:p>
         </w:tc>

</xml_diff>